<commit_message>
Add reverse bias check results and update electrical characterization documentation
</commit_message>
<xml_diff>
--- a/deliverable/Electrical_Characterization_section.docx
+++ b/deliverable/Electrical_Characterization_section.docx
@@ -1289,16 +1289,17 @@
         <w:tblLook w:firstColumn="1" w:firstRow="1" w:lastColumn="0" w:lastRow="0" w:noHBand="0" w:noVBand="1" w:val="04A0"/>
       </w:tblPr>
       <w:tblGrid>
-        <w:gridCol w:w="1728"/>
-        <w:gridCol w:w="1728"/>
-        <w:gridCol w:w="1728"/>
-        <w:gridCol w:w="1728"/>
-        <w:gridCol w:w="1728"/>
+        <w:gridCol w:w="1440"/>
+        <w:gridCol w:w="1440"/>
+        <w:gridCol w:w="1440"/>
+        <w:gridCol w:w="1440"/>
+        <w:gridCol w:w="1440"/>
+        <w:gridCol w:w="1440"/>
       </w:tblGrid>
       <w:tr>
         <w:tc>
           <w:tcPr>
-            <w:tcW w:type="dxa" w:w="1361"/>
+            <w:tcW w:type="dxa" w:w="1134"/>
           </w:tcPr>
           <w:p>
             <w:r/>
@@ -1313,7 +1314,7 @@
         </w:tc>
         <w:tc>
           <w:tcPr>
-            <w:tcW w:type="dxa" w:w="1361"/>
+            <w:tcW w:type="dxa" w:w="1134"/>
           </w:tcPr>
           <w:p>
             <w:r/>
@@ -1328,7 +1329,7 @@
         </w:tc>
         <w:tc>
           <w:tcPr>
-            <w:tcW w:type="dxa" w:w="2381"/>
+            <w:tcW w:type="dxa" w:w="2041"/>
           </w:tcPr>
           <w:p>
             <w:r/>
@@ -1343,7 +1344,7 @@
         </w:tc>
         <w:tc>
           <w:tcPr>
-            <w:tcW w:type="dxa" w:w="2268"/>
+            <w:tcW w:type="dxa" w:w="1928"/>
           </w:tcPr>
           <w:p>
             <w:r/>
@@ -1358,7 +1359,7 @@
         </w:tc>
         <w:tc>
           <w:tcPr>
-            <w:tcW w:type="dxa" w:w="1701"/>
+            <w:tcW w:type="dxa" w:w="1474"/>
           </w:tcPr>
           <w:p>
             <w:r/>
@@ -1371,11 +1372,26 @@
             </w:r>
           </w:p>
         </w:tc>
+        <w:tc>
+          <w:tcPr>
+            <w:tcW w:type="dxa" w:w="1701"/>
+          </w:tcPr>
+          <w:p>
+            <w:r/>
+            <w:r>
+              <w:rPr>
+                <w:b/>
+                <w:sz w:val="16"/>
+              </w:rPr>
+              <w:t>Reverse check</w:t>
+            </w:r>
+          </w:p>
+        </w:tc>
       </w:tr>
       <w:tr>
         <w:tc>
           <w:tcPr>
-            <w:tcW w:type="dxa" w:w="1361"/>
+            <w:tcW w:type="dxa" w:w="1134"/>
           </w:tcPr>
           <w:p>
             <w:r/>
@@ -1389,7 +1405,7 @@
         </w:tc>
         <w:tc>
           <w:tcPr>
-            <w:tcW w:type="dxa" w:w="1361"/>
+            <w:tcW w:type="dxa" w:w="1134"/>
           </w:tcPr>
           <w:p>
             <w:r/>
@@ -1403,7 +1419,7 @@
         </w:tc>
         <w:tc>
           <w:tcPr>
-            <w:tcW w:type="dxa" w:w="2381"/>
+            <w:tcW w:type="dxa" w:w="2041"/>
           </w:tcPr>
           <w:p>
             <w:r/>
@@ -1417,7 +1433,7 @@
         </w:tc>
         <w:tc>
           <w:tcPr>
-            <w:tcW w:type="dxa" w:w="2268"/>
+            <w:tcW w:type="dxa" w:w="1928"/>
           </w:tcPr>
           <w:p>
             <w:r/>
@@ -1431,7 +1447,7 @@
         </w:tc>
         <w:tc>
           <w:tcPr>
-            <w:tcW w:type="dxa" w:w="1701"/>
+            <w:tcW w:type="dxa" w:w="1474"/>
           </w:tcPr>
           <w:p>
             <w:r/>
@@ -1443,11 +1459,25 @@
             </w:r>
           </w:p>
         </w:tc>
+        <w:tc>
+          <w:tcPr>
+            <w:tcW w:type="dxa" w:w="1701"/>
+          </w:tcPr>
+          <w:p>
+            <w:r/>
+            <w:r>
+              <w:rPr>
+                <w:sz w:val="16"/>
+              </w:rPr>
+              <w:t>6 clean</w:t>
+            </w:r>
+          </w:p>
+        </w:tc>
       </w:tr>
       <w:tr>
         <w:tc>
           <w:tcPr>
-            <w:tcW w:type="dxa" w:w="1361"/>
+            <w:tcW w:type="dxa" w:w="1134"/>
           </w:tcPr>
           <w:p>
             <w:r/>
@@ -1461,7 +1491,7 @@
         </w:tc>
         <w:tc>
           <w:tcPr>
-            <w:tcW w:type="dxa" w:w="1361"/>
+            <w:tcW w:type="dxa" w:w="1134"/>
           </w:tcPr>
           <w:p>
             <w:r/>
@@ -1475,7 +1505,7 @@
         </w:tc>
         <w:tc>
           <w:tcPr>
-            <w:tcW w:type="dxa" w:w="2381"/>
+            <w:tcW w:type="dxa" w:w="2041"/>
           </w:tcPr>
           <w:p>
             <w:r/>
@@ -1489,7 +1519,7 @@
         </w:tc>
         <w:tc>
           <w:tcPr>
-            <w:tcW w:type="dxa" w:w="2268"/>
+            <w:tcW w:type="dxa" w:w="1928"/>
           </w:tcPr>
           <w:p>
             <w:r/>
@@ -1503,7 +1533,7 @@
         </w:tc>
         <w:tc>
           <w:tcPr>
-            <w:tcW w:type="dxa" w:w="1701"/>
+            <w:tcW w:type="dxa" w:w="1474"/>
           </w:tcPr>
           <w:p>
             <w:r/>
@@ -1515,11 +1545,25 @@
             </w:r>
           </w:p>
         </w:tc>
+        <w:tc>
+          <w:tcPr>
+            <w:tcW w:type="dxa" w:w="1701"/>
+          </w:tcPr>
+          <w:p>
+            <w:r/>
+            <w:r>
+              <w:rPr>
+                <w:sz w:val="16"/>
+              </w:rPr>
+              <w:t>5 clean</w:t>
+            </w:r>
+          </w:p>
+        </w:tc>
       </w:tr>
       <w:tr>
         <w:tc>
           <w:tcPr>
-            <w:tcW w:type="dxa" w:w="1361"/>
+            <w:tcW w:type="dxa" w:w="1134"/>
           </w:tcPr>
           <w:p>
             <w:r/>
@@ -1533,7 +1577,7 @@
         </w:tc>
         <w:tc>
           <w:tcPr>
-            <w:tcW w:type="dxa" w:w="1361"/>
+            <w:tcW w:type="dxa" w:w="1134"/>
           </w:tcPr>
           <w:p>
             <w:r/>
@@ -1547,7 +1591,7 @@
         </w:tc>
         <w:tc>
           <w:tcPr>
-            <w:tcW w:type="dxa" w:w="2381"/>
+            <w:tcW w:type="dxa" w:w="2041"/>
           </w:tcPr>
           <w:p>
             <w:r/>
@@ -1561,7 +1605,7 @@
         </w:tc>
         <w:tc>
           <w:tcPr>
-            <w:tcW w:type="dxa" w:w="2268"/>
+            <w:tcW w:type="dxa" w:w="1928"/>
           </w:tcPr>
           <w:p>
             <w:r/>
@@ -1575,7 +1619,7 @@
         </w:tc>
         <w:tc>
           <w:tcPr>
-            <w:tcW w:type="dxa" w:w="1701"/>
+            <w:tcW w:type="dxa" w:w="1474"/>
           </w:tcPr>
           <w:p>
             <w:r/>
@@ -1587,11 +1631,25 @@
             </w:r>
           </w:p>
         </w:tc>
+        <w:tc>
+          <w:tcPr>
+            <w:tcW w:type="dxa" w:w="1701"/>
+          </w:tcPr>
+          <w:p>
+            <w:r/>
+            <w:r>
+              <w:rPr>
+                <w:sz w:val="16"/>
+              </w:rPr>
+              <w:t>1 clean, 1 shunted</w:t>
+            </w:r>
+          </w:p>
+        </w:tc>
       </w:tr>
       <w:tr>
         <w:tc>
           <w:tcPr>
-            <w:tcW w:type="dxa" w:w="1361"/>
+            <w:tcW w:type="dxa" w:w="1134"/>
           </w:tcPr>
           <w:p>
             <w:r/>
@@ -1605,7 +1663,7 @@
         </w:tc>
         <w:tc>
           <w:tcPr>
-            <w:tcW w:type="dxa" w:w="1361"/>
+            <w:tcW w:type="dxa" w:w="1134"/>
           </w:tcPr>
           <w:p>
             <w:r/>
@@ -1619,7 +1677,7 @@
         </w:tc>
         <w:tc>
           <w:tcPr>
-            <w:tcW w:type="dxa" w:w="2381"/>
+            <w:tcW w:type="dxa" w:w="2041"/>
           </w:tcPr>
           <w:p>
             <w:r/>
@@ -1633,7 +1691,7 @@
         </w:tc>
         <w:tc>
           <w:tcPr>
-            <w:tcW w:type="dxa" w:w="2268"/>
+            <w:tcW w:type="dxa" w:w="1928"/>
           </w:tcPr>
           <w:p>
             <w:r/>
@@ -1647,7 +1705,7 @@
         </w:tc>
         <w:tc>
           <w:tcPr>
-            <w:tcW w:type="dxa" w:w="1701"/>
+            <w:tcW w:type="dxa" w:w="1474"/>
           </w:tcPr>
           <w:p>
             <w:r/>
@@ -1659,11 +1717,25 @@
             </w:r>
           </w:p>
         </w:tc>
+        <w:tc>
+          <w:tcPr>
+            <w:tcW w:type="dxa" w:w="1701"/>
+          </w:tcPr>
+          <w:p>
+            <w:r/>
+            <w:r>
+              <w:rPr>
+                <w:sz w:val="16"/>
+              </w:rPr>
+              <w:t>3 clean</w:t>
+            </w:r>
+          </w:p>
+        </w:tc>
       </w:tr>
       <w:tr>
         <w:tc>
           <w:tcPr>
-            <w:tcW w:type="dxa" w:w="1361"/>
+            <w:tcW w:type="dxa" w:w="1134"/>
           </w:tcPr>
           <w:p>
             <w:r/>
@@ -1677,7 +1749,7 @@
         </w:tc>
         <w:tc>
           <w:tcPr>
-            <w:tcW w:type="dxa" w:w="1361"/>
+            <w:tcW w:type="dxa" w:w="1134"/>
           </w:tcPr>
           <w:p>
             <w:r/>
@@ -1691,7 +1763,7 @@
         </w:tc>
         <w:tc>
           <w:tcPr>
-            <w:tcW w:type="dxa" w:w="2381"/>
+            <w:tcW w:type="dxa" w:w="2041"/>
           </w:tcPr>
           <w:p>
             <w:r/>
@@ -1705,7 +1777,7 @@
         </w:tc>
         <w:tc>
           <w:tcPr>
-            <w:tcW w:type="dxa" w:w="2268"/>
+            <w:tcW w:type="dxa" w:w="1928"/>
           </w:tcPr>
           <w:p>
             <w:r/>
@@ -1719,7 +1791,7 @@
         </w:tc>
         <w:tc>
           <w:tcPr>
-            <w:tcW w:type="dxa" w:w="1701"/>
+            <w:tcW w:type="dxa" w:w="1474"/>
           </w:tcPr>
           <w:p>
             <w:r/>
@@ -1731,11 +1803,25 @@
             </w:r>
           </w:p>
         </w:tc>
+        <w:tc>
+          <w:tcPr>
+            <w:tcW w:type="dxa" w:w="1701"/>
+          </w:tcPr>
+          <w:p>
+            <w:r/>
+            <w:r>
+              <w:rPr>
+                <w:sz w:val="16"/>
+              </w:rPr>
+              <w:t>4 clean</w:t>
+            </w:r>
+          </w:p>
+        </w:tc>
       </w:tr>
       <w:tr>
         <w:tc>
           <w:tcPr>
-            <w:tcW w:type="dxa" w:w="1361"/>
+            <w:tcW w:type="dxa" w:w="1134"/>
           </w:tcPr>
           <w:p>
             <w:r/>
@@ -1749,7 +1835,7 @@
         </w:tc>
         <w:tc>
           <w:tcPr>
-            <w:tcW w:type="dxa" w:w="1361"/>
+            <w:tcW w:type="dxa" w:w="1134"/>
           </w:tcPr>
           <w:p>
             <w:r/>
@@ -1763,7 +1849,7 @@
         </w:tc>
         <w:tc>
           <w:tcPr>
-            <w:tcW w:type="dxa" w:w="2381"/>
+            <w:tcW w:type="dxa" w:w="2041"/>
           </w:tcPr>
           <w:p>
             <w:r/>
@@ -1777,7 +1863,7 @@
         </w:tc>
         <w:tc>
           <w:tcPr>
-            <w:tcW w:type="dxa" w:w="2268"/>
+            <w:tcW w:type="dxa" w:w="1928"/>
           </w:tcPr>
           <w:p>
             <w:r/>
@@ -1791,7 +1877,7 @@
         </w:tc>
         <w:tc>
           <w:tcPr>
-            <w:tcW w:type="dxa" w:w="1701"/>
+            <w:tcW w:type="dxa" w:w="1474"/>
           </w:tcPr>
           <w:p>
             <w:r/>
@@ -1803,11 +1889,25 @@
             </w:r>
           </w:p>
         </w:tc>
+        <w:tc>
+          <w:tcPr>
+            <w:tcW w:type="dxa" w:w="1701"/>
+          </w:tcPr>
+          <w:p>
+            <w:r/>
+            <w:r>
+              <w:rPr>
+                <w:sz w:val="16"/>
+              </w:rPr>
+              <w:t>3 clean</w:t>
+            </w:r>
+          </w:p>
+        </w:tc>
       </w:tr>
       <w:tr>
         <w:tc>
           <w:tcPr>
-            <w:tcW w:type="dxa" w:w="1361"/>
+            <w:tcW w:type="dxa" w:w="1134"/>
           </w:tcPr>
           <w:p>
             <w:r/>
@@ -1821,7 +1921,7 @@
         </w:tc>
         <w:tc>
           <w:tcPr>
-            <w:tcW w:type="dxa" w:w="1361"/>
+            <w:tcW w:type="dxa" w:w="1134"/>
           </w:tcPr>
           <w:p>
             <w:r/>
@@ -1835,7 +1935,7 @@
         </w:tc>
         <w:tc>
           <w:tcPr>
-            <w:tcW w:type="dxa" w:w="2381"/>
+            <w:tcW w:type="dxa" w:w="2041"/>
           </w:tcPr>
           <w:p>
             <w:r/>
@@ -1849,7 +1949,7 @@
         </w:tc>
         <w:tc>
           <w:tcPr>
-            <w:tcW w:type="dxa" w:w="2268"/>
+            <w:tcW w:type="dxa" w:w="1928"/>
           </w:tcPr>
           <w:p>
             <w:r/>
@@ -1863,7 +1963,7 @@
         </w:tc>
         <w:tc>
           <w:tcPr>
-            <w:tcW w:type="dxa" w:w="1701"/>
+            <w:tcW w:type="dxa" w:w="1474"/>
           </w:tcPr>
           <w:p>
             <w:r/>
@@ -1875,11 +1975,25 @@
             </w:r>
           </w:p>
         </w:tc>
+        <w:tc>
+          <w:tcPr>
+            <w:tcW w:type="dxa" w:w="1701"/>
+          </w:tcPr>
+          <w:p>
+            <w:r/>
+            <w:r>
+              <w:rPr>
+                <w:sz w:val="16"/>
+              </w:rPr>
+              <w:t>4 clean</w:t>
+            </w:r>
+          </w:p>
+        </w:tc>
       </w:tr>
       <w:tr>
         <w:tc>
           <w:tcPr>
-            <w:tcW w:type="dxa" w:w="1361"/>
+            <w:tcW w:type="dxa" w:w="1134"/>
           </w:tcPr>
           <w:p>
             <w:r/>
@@ -1893,7 +2007,7 @@
         </w:tc>
         <w:tc>
           <w:tcPr>
-            <w:tcW w:type="dxa" w:w="1361"/>
+            <w:tcW w:type="dxa" w:w="1134"/>
           </w:tcPr>
           <w:p>
             <w:r/>
@@ -1907,7 +2021,7 @@
         </w:tc>
         <w:tc>
           <w:tcPr>
-            <w:tcW w:type="dxa" w:w="2381"/>
+            <w:tcW w:type="dxa" w:w="2041"/>
           </w:tcPr>
           <w:p>
             <w:r/>
@@ -1921,7 +2035,7 @@
         </w:tc>
         <w:tc>
           <w:tcPr>
-            <w:tcW w:type="dxa" w:w="2268"/>
+            <w:tcW w:type="dxa" w:w="1928"/>
           </w:tcPr>
           <w:p>
             <w:r/>
@@ -1935,6 +2049,20 @@
         </w:tc>
         <w:tc>
           <w:tcPr>
+            <w:tcW w:type="dxa" w:w="1474"/>
+          </w:tcPr>
+          <w:p>
+            <w:r/>
+            <w:r>
+              <w:rPr>
+                <w:sz w:val="16"/>
+              </w:rPr>
+              <w:t>1.75–2.06</w:t>
+            </w:r>
+          </w:p>
+        </w:tc>
+        <w:tc>
+          <w:tcPr>
             <w:tcW w:type="dxa" w:w="1701"/>
           </w:tcPr>
           <w:p>
@@ -1943,7 +2071,7 @@
               <w:rPr>
                 <w:sz w:val="16"/>
               </w:rPr>
-              <w:t>1.75–2.06</w:t>
+              <w:t>3 clean</w:t>
             </w:r>
           </w:p>
         </w:tc>
@@ -2335,7 +2463,55 @@
           <w:b w:val="0"/>
           <w:i w:val="0"/>
         </w:rPr>
-        <w:t>F.  Summary</w:t>
+        <w:t>F.  Reverse bias check</w:t>
+      </w:r>
+    </w:p>
+    <w:p>
+      <w:r>
+        <w:rPr>
+          <w:b w:val="0"/>
+          <w:i w:val="0"/>
+        </w:rPr>
+        <w:t>Every surviving red channel was also biased in reverse to look for conduction paths around the junction. The die sits in series with the 100 kΩ across the 5 V rail and the meter reads the voltage across the die, so the die's own resistance sets the reading. A healthy junction leaves the meter's 10 MΩ input impedance as the only load and reads 4.99 V; a shunt pulls it down. Reading the small voltage across the sense resistor instead does not work with a handheld meter, because 1 nA through 98 kΩ is 0.1 mV and sits inside the meter's noise.</w:t>
+      </w:r>
+    </w:p>
+    <w:p>
+      <w:r>
+        <w:rPr>
+          <w:b w:val="0"/>
+          <w:i w:val="0"/>
+        </w:rPr>
+        <w:t>Thirty-four channels were measured. Thirty read 4.988 to 4.989 V, the open-die limit, which places their shunt resistance above 10 MΩ and their leakage below roughly 50 nA. Three read 0 V and confirm the round 1 shorts. One channel, S3 D1 red, read 0.085 V, which corresponds to a shunt of about 1.7 kΩ.</w:t>
+      </w:r>
+    </w:p>
+    <w:p>
+      <w:r>
+        <w:rPr>
+          <w:b w:val="0"/>
+          <w:i w:val="0"/>
+        </w:rPr>
+        <w:t>That channel is the one the sweep had already flagged in Section C, where the forward characteristic implied roughly 2.9 kΩ. Two measurements at opposite bias polarity agree to within a factor of two on a defect that a 1 mA diode test passes. It was recorded as “suspect” in the round 1 screening on the operator's judgement alone; it is now confirmed, and condition 3's yield stands as measured rather than estimated.</w:t>
+      </w:r>
+    </w:p>
+    <w:p>
+      <w:r>
+        <w:rPr>
+          <w:b w:val="0"/>
+          <w:i w:val="0"/>
+        </w:rPr>
+        <w:t>The result is otherwise a null, and worth stating as one. Condition 8 loses two channels to shorts, but its survivors are indistinguishable from those of conditions 5 and 7, so its failures are isolated rather than a coupon-wide contamination problem. No condition other than 3 carries a partial conduction path. Reverse bias corroborates the yield ranking; it does not add a new axis to it.</w:t>
+      </w:r>
+    </w:p>
+    <w:p>
+      <w:pPr>
+        <w:pStyle w:val="Heading2"/>
+      </w:pPr>
+      <w:r>
+        <w:rPr>
+          <w:b w:val="0"/>
+          <w:i w:val="0"/>
+        </w:rPr>
+        <w:t>G.  Summary</w:t>
       </w:r>
     </w:p>
     <w:p>
@@ -2358,17 +2534,18 @@
         <w:tblLook w:firstColumn="1" w:firstRow="1" w:lastColumn="0" w:lastRow="0" w:noHBand="0" w:noVBand="1" w:val="04A0"/>
       </w:tblPr>
       <w:tblGrid>
-        <w:gridCol w:w="1440"/>
-        <w:gridCol w:w="1440"/>
-        <w:gridCol w:w="1440"/>
-        <w:gridCol w:w="1440"/>
-        <w:gridCol w:w="1440"/>
-        <w:gridCol w:w="1440"/>
+        <w:gridCol w:w="1234"/>
+        <w:gridCol w:w="1234"/>
+        <w:gridCol w:w="1234"/>
+        <w:gridCol w:w="1234"/>
+        <w:gridCol w:w="1234"/>
+        <w:gridCol w:w="1234"/>
+        <w:gridCol w:w="1234"/>
       </w:tblGrid>
       <w:tr>
         <w:tc>
           <w:tcPr>
-            <w:tcW w:type="dxa" w:w="1077"/>
+            <w:tcW w:type="dxa" w:w="964"/>
           </w:tcPr>
           <w:p>
             <w:r/>
@@ -2383,7 +2560,7 @@
         </w:tc>
         <w:tc>
           <w:tcPr>
-            <w:tcW w:type="dxa" w:w="1077"/>
+            <w:tcW w:type="dxa" w:w="964"/>
           </w:tcPr>
           <w:p>
             <w:r/>
@@ -2398,7 +2575,7 @@
         </w:tc>
         <w:tc>
           <w:tcPr>
-            <w:tcW w:type="dxa" w:w="2721"/>
+            <w:tcW w:type="dxa" w:w="2381"/>
           </w:tcPr>
           <w:p>
             <w:r/>
@@ -2413,7 +2590,7 @@
         </w:tc>
         <w:tc>
           <w:tcPr>
-            <w:tcW w:type="dxa" w:w="1644"/>
+            <w:tcW w:type="dxa" w:w="1474"/>
           </w:tcPr>
           <w:p>
             <w:r/>
@@ -2428,7 +2605,7 @@
         </w:tc>
         <w:tc>
           <w:tcPr>
-            <w:tcW w:type="dxa" w:w="1247"/>
+            <w:tcW w:type="dxa" w:w="1134"/>
           </w:tcPr>
           <w:p>
             <w:r/>
@@ -2443,7 +2620,22 @@
         </w:tc>
         <w:tc>
           <w:tcPr>
-            <w:tcW w:type="dxa" w:w="1474"/>
+            <w:tcW w:type="dxa" w:w="1020"/>
+          </w:tcPr>
+          <w:p>
+            <w:r/>
+            <w:r>
+              <w:rPr>
+                <w:b/>
+                <w:sz w:val="16"/>
+              </w:rPr>
+              <w:t>Reverse</w:t>
+            </w:r>
+          </w:p>
+        </w:tc>
+        <w:tc>
+          <w:tcPr>
+            <w:tcW w:type="dxa" w:w="1361"/>
           </w:tcPr>
           <w:p>
             <w:r/>
@@ -2460,7 +2652,7 @@
       <w:tr>
         <w:tc>
           <w:tcPr>
-            <w:tcW w:type="dxa" w:w="1077"/>
+            <w:tcW w:type="dxa" w:w="964"/>
           </w:tcPr>
           <w:p>
             <w:r/>
@@ -2474,7 +2666,7 @@
         </w:tc>
         <w:tc>
           <w:tcPr>
-            <w:tcW w:type="dxa" w:w="1077"/>
+            <w:tcW w:type="dxa" w:w="964"/>
           </w:tcPr>
           <w:p>
             <w:r/>
@@ -2488,7 +2680,7 @@
         </w:tc>
         <w:tc>
           <w:tcPr>
-            <w:tcW w:type="dxa" w:w="2721"/>
+            <w:tcW w:type="dxa" w:w="2381"/>
           </w:tcPr>
           <w:p>
             <w:r/>
@@ -2502,7 +2694,7 @@
         </w:tc>
         <w:tc>
           <w:tcPr>
-            <w:tcW w:type="dxa" w:w="1644"/>
+            <w:tcW w:type="dxa" w:w="1474"/>
           </w:tcPr>
           <w:p>
             <w:r/>
@@ -2516,7 +2708,7 @@
         </w:tc>
         <w:tc>
           <w:tcPr>
-            <w:tcW w:type="dxa" w:w="1247"/>
+            <w:tcW w:type="dxa" w:w="1134"/>
           </w:tcPr>
           <w:p>
             <w:r/>
@@ -2530,7 +2722,21 @@
         </w:tc>
         <w:tc>
           <w:tcPr>
-            <w:tcW w:type="dxa" w:w="1474"/>
+            <w:tcW w:type="dxa" w:w="1020"/>
+          </w:tcPr>
+          <w:p>
+            <w:r/>
+            <w:r>
+              <w:rPr>
+                <w:sz w:val="16"/>
+              </w:rPr>
+              <w:t>clean</w:t>
+            </w:r>
+          </w:p>
+        </w:tc>
+        <w:tc>
+          <w:tcPr>
+            <w:tcW w:type="dxa" w:w="1361"/>
           </w:tcPr>
           <w:p>
             <w:r/>
@@ -2546,7 +2752,7 @@
       <w:tr>
         <w:tc>
           <w:tcPr>
-            <w:tcW w:type="dxa" w:w="1077"/>
+            <w:tcW w:type="dxa" w:w="964"/>
           </w:tcPr>
           <w:p>
             <w:r/>
@@ -2560,7 +2766,7 @@
         </w:tc>
         <w:tc>
           <w:tcPr>
-            <w:tcW w:type="dxa" w:w="1077"/>
+            <w:tcW w:type="dxa" w:w="964"/>
           </w:tcPr>
           <w:p>
             <w:r/>
@@ -2574,7 +2780,7 @@
         </w:tc>
         <w:tc>
           <w:tcPr>
-            <w:tcW w:type="dxa" w:w="2721"/>
+            <w:tcW w:type="dxa" w:w="2381"/>
           </w:tcPr>
           <w:p>
             <w:r/>
@@ -2588,7 +2794,7 @@
         </w:tc>
         <w:tc>
           <w:tcPr>
-            <w:tcW w:type="dxa" w:w="1644"/>
+            <w:tcW w:type="dxa" w:w="1474"/>
           </w:tcPr>
           <w:p>
             <w:r/>
@@ -2602,7 +2808,7 @@
         </w:tc>
         <w:tc>
           <w:tcPr>
-            <w:tcW w:type="dxa" w:w="1247"/>
+            <w:tcW w:type="dxa" w:w="1134"/>
           </w:tcPr>
           <w:p>
             <w:r/>
@@ -2616,7 +2822,21 @@
         </w:tc>
         <w:tc>
           <w:tcPr>
-            <w:tcW w:type="dxa" w:w="1474"/>
+            <w:tcW w:type="dxa" w:w="1020"/>
+          </w:tcPr>
+          <w:p>
+            <w:r/>
+            <w:r>
+              <w:rPr>
+                <w:sz w:val="16"/>
+              </w:rPr>
+              <w:t>clean</w:t>
+            </w:r>
+          </w:p>
+        </w:tc>
+        <w:tc>
+          <w:tcPr>
+            <w:tcW w:type="dxa" w:w="1361"/>
           </w:tcPr>
           <w:p>
             <w:r/>
@@ -2632,7 +2852,7 @@
       <w:tr>
         <w:tc>
           <w:tcPr>
-            <w:tcW w:type="dxa" w:w="1077"/>
+            <w:tcW w:type="dxa" w:w="964"/>
           </w:tcPr>
           <w:p>
             <w:r/>
@@ -2646,7 +2866,7 @@
         </w:tc>
         <w:tc>
           <w:tcPr>
-            <w:tcW w:type="dxa" w:w="1077"/>
+            <w:tcW w:type="dxa" w:w="964"/>
           </w:tcPr>
           <w:p>
             <w:r/>
@@ -2660,7 +2880,7 @@
         </w:tc>
         <w:tc>
           <w:tcPr>
-            <w:tcW w:type="dxa" w:w="2721"/>
+            <w:tcW w:type="dxa" w:w="2381"/>
           </w:tcPr>
           <w:p>
             <w:r/>
@@ -2674,7 +2894,7 @@
         </w:tc>
         <w:tc>
           <w:tcPr>
-            <w:tcW w:type="dxa" w:w="1644"/>
+            <w:tcW w:type="dxa" w:w="1474"/>
           </w:tcPr>
           <w:p>
             <w:r/>
@@ -2688,7 +2908,7 @@
         </w:tc>
         <w:tc>
           <w:tcPr>
-            <w:tcW w:type="dxa" w:w="1247"/>
+            <w:tcW w:type="dxa" w:w="1134"/>
           </w:tcPr>
           <w:p>
             <w:r/>
@@ -2702,7 +2922,21 @@
         </w:tc>
         <w:tc>
           <w:tcPr>
-            <w:tcW w:type="dxa" w:w="1474"/>
+            <w:tcW w:type="dxa" w:w="1020"/>
+          </w:tcPr>
+          <w:p>
+            <w:r/>
+            <w:r>
+              <w:rPr>
+                <w:sz w:val="16"/>
+              </w:rPr>
+              <w:t>1 shunt</w:t>
+            </w:r>
+          </w:p>
+        </w:tc>
+        <w:tc>
+          <w:tcPr>
+            <w:tcW w:type="dxa" w:w="1361"/>
           </w:tcPr>
           <w:p>
             <w:r/>
@@ -2718,7 +2952,7 @@
       <w:tr>
         <w:tc>
           <w:tcPr>
-            <w:tcW w:type="dxa" w:w="1077"/>
+            <w:tcW w:type="dxa" w:w="964"/>
           </w:tcPr>
           <w:p>
             <w:r/>
@@ -2732,7 +2966,7 @@
         </w:tc>
         <w:tc>
           <w:tcPr>
-            <w:tcW w:type="dxa" w:w="1077"/>
+            <w:tcW w:type="dxa" w:w="964"/>
           </w:tcPr>
           <w:p>
             <w:r/>
@@ -2746,7 +2980,7 @@
         </w:tc>
         <w:tc>
           <w:tcPr>
-            <w:tcW w:type="dxa" w:w="2721"/>
+            <w:tcW w:type="dxa" w:w="2381"/>
           </w:tcPr>
           <w:p>
             <w:r/>
@@ -2760,7 +2994,7 @@
         </w:tc>
         <w:tc>
           <w:tcPr>
-            <w:tcW w:type="dxa" w:w="1644"/>
+            <w:tcW w:type="dxa" w:w="1474"/>
           </w:tcPr>
           <w:p>
             <w:r/>
@@ -2774,7 +3008,7 @@
         </w:tc>
         <w:tc>
           <w:tcPr>
-            <w:tcW w:type="dxa" w:w="1247"/>
+            <w:tcW w:type="dxa" w:w="1134"/>
           </w:tcPr>
           <w:p>
             <w:r/>
@@ -2788,7 +3022,21 @@
         </w:tc>
         <w:tc>
           <w:tcPr>
-            <w:tcW w:type="dxa" w:w="1474"/>
+            <w:tcW w:type="dxa" w:w="1020"/>
+          </w:tcPr>
+          <w:p>
+            <w:r/>
+            <w:r>
+              <w:rPr>
+                <w:sz w:val="16"/>
+              </w:rPr>
+              <w:t>clean</w:t>
+            </w:r>
+          </w:p>
+        </w:tc>
+        <w:tc>
+          <w:tcPr>
+            <w:tcW w:type="dxa" w:w="1361"/>
           </w:tcPr>
           <w:p>
             <w:r/>
@@ -2804,7 +3052,7 @@
       <w:tr>
         <w:tc>
           <w:tcPr>
-            <w:tcW w:type="dxa" w:w="1077"/>
+            <w:tcW w:type="dxa" w:w="964"/>
           </w:tcPr>
           <w:p>
             <w:r/>
@@ -2818,7 +3066,7 @@
         </w:tc>
         <w:tc>
           <w:tcPr>
-            <w:tcW w:type="dxa" w:w="1077"/>
+            <w:tcW w:type="dxa" w:w="964"/>
           </w:tcPr>
           <w:p>
             <w:r/>
@@ -2832,7 +3080,7 @@
         </w:tc>
         <w:tc>
           <w:tcPr>
-            <w:tcW w:type="dxa" w:w="2721"/>
+            <w:tcW w:type="dxa" w:w="2381"/>
           </w:tcPr>
           <w:p>
             <w:r/>
@@ -2846,7 +3094,7 @@
         </w:tc>
         <w:tc>
           <w:tcPr>
-            <w:tcW w:type="dxa" w:w="1644"/>
+            <w:tcW w:type="dxa" w:w="1474"/>
           </w:tcPr>
           <w:p>
             <w:r/>
@@ -2860,7 +3108,7 @@
         </w:tc>
         <w:tc>
           <w:tcPr>
-            <w:tcW w:type="dxa" w:w="1247"/>
+            <w:tcW w:type="dxa" w:w="1134"/>
           </w:tcPr>
           <w:p>
             <w:r/>
@@ -2874,7 +3122,21 @@
         </w:tc>
         <w:tc>
           <w:tcPr>
-            <w:tcW w:type="dxa" w:w="1474"/>
+            <w:tcW w:type="dxa" w:w="1020"/>
+          </w:tcPr>
+          <w:p>
+            <w:r/>
+            <w:r>
+              <w:rPr>
+                <w:sz w:val="16"/>
+              </w:rPr>
+              <w:t>clean</w:t>
+            </w:r>
+          </w:p>
+        </w:tc>
+        <w:tc>
+          <w:tcPr>
+            <w:tcW w:type="dxa" w:w="1361"/>
           </w:tcPr>
           <w:p>
             <w:r/>
@@ -2890,7 +3152,7 @@
       <w:tr>
         <w:tc>
           <w:tcPr>
-            <w:tcW w:type="dxa" w:w="1077"/>
+            <w:tcW w:type="dxa" w:w="964"/>
           </w:tcPr>
           <w:p>
             <w:r/>
@@ -2904,7 +3166,7 @@
         </w:tc>
         <w:tc>
           <w:tcPr>
-            <w:tcW w:type="dxa" w:w="1077"/>
+            <w:tcW w:type="dxa" w:w="964"/>
           </w:tcPr>
           <w:p>
             <w:r/>
@@ -2918,7 +3180,7 @@
         </w:tc>
         <w:tc>
           <w:tcPr>
-            <w:tcW w:type="dxa" w:w="2721"/>
+            <w:tcW w:type="dxa" w:w="2381"/>
           </w:tcPr>
           <w:p>
             <w:r/>
@@ -2932,7 +3194,7 @@
         </w:tc>
         <w:tc>
           <w:tcPr>
-            <w:tcW w:type="dxa" w:w="1644"/>
+            <w:tcW w:type="dxa" w:w="1474"/>
           </w:tcPr>
           <w:p>
             <w:r/>
@@ -2946,7 +3208,7 @@
         </w:tc>
         <w:tc>
           <w:tcPr>
-            <w:tcW w:type="dxa" w:w="1247"/>
+            <w:tcW w:type="dxa" w:w="1134"/>
           </w:tcPr>
           <w:p>
             <w:r/>
@@ -2960,7 +3222,21 @@
         </w:tc>
         <w:tc>
           <w:tcPr>
-            <w:tcW w:type="dxa" w:w="1474"/>
+            <w:tcW w:type="dxa" w:w="1020"/>
+          </w:tcPr>
+          <w:p>
+            <w:r/>
+            <w:r>
+              <w:rPr>
+                <w:sz w:val="16"/>
+              </w:rPr>
+              <w:t>clean</w:t>
+            </w:r>
+          </w:p>
+        </w:tc>
+        <w:tc>
+          <w:tcPr>
+            <w:tcW w:type="dxa" w:w="1361"/>
           </w:tcPr>
           <w:p>
             <w:r/>
@@ -2976,7 +3252,7 @@
       <w:tr>
         <w:tc>
           <w:tcPr>
-            <w:tcW w:type="dxa" w:w="1077"/>
+            <w:tcW w:type="dxa" w:w="964"/>
           </w:tcPr>
           <w:p>
             <w:r/>
@@ -2990,7 +3266,7 @@
         </w:tc>
         <w:tc>
           <w:tcPr>
-            <w:tcW w:type="dxa" w:w="1077"/>
+            <w:tcW w:type="dxa" w:w="964"/>
           </w:tcPr>
           <w:p>
             <w:r/>
@@ -3004,7 +3280,7 @@
         </w:tc>
         <w:tc>
           <w:tcPr>
-            <w:tcW w:type="dxa" w:w="2721"/>
+            <w:tcW w:type="dxa" w:w="2381"/>
           </w:tcPr>
           <w:p>
             <w:r/>
@@ -3018,7 +3294,7 @@
         </w:tc>
         <w:tc>
           <w:tcPr>
-            <w:tcW w:type="dxa" w:w="1644"/>
+            <w:tcW w:type="dxa" w:w="1474"/>
           </w:tcPr>
           <w:p>
             <w:r/>
@@ -3032,7 +3308,7 @@
         </w:tc>
         <w:tc>
           <w:tcPr>
-            <w:tcW w:type="dxa" w:w="1247"/>
+            <w:tcW w:type="dxa" w:w="1134"/>
           </w:tcPr>
           <w:p>
             <w:r/>
@@ -3046,7 +3322,21 @@
         </w:tc>
         <w:tc>
           <w:tcPr>
-            <w:tcW w:type="dxa" w:w="1474"/>
+            <w:tcW w:type="dxa" w:w="1020"/>
+          </w:tcPr>
+          <w:p>
+            <w:r/>
+            <w:r>
+              <w:rPr>
+                <w:sz w:val="16"/>
+              </w:rPr>
+              <w:t>clean</w:t>
+            </w:r>
+          </w:p>
+        </w:tc>
+        <w:tc>
+          <w:tcPr>
+            <w:tcW w:type="dxa" w:w="1361"/>
           </w:tcPr>
           <w:p>
             <w:r/>
@@ -3062,7 +3352,7 @@
       <w:tr>
         <w:tc>
           <w:tcPr>
-            <w:tcW w:type="dxa" w:w="1077"/>
+            <w:tcW w:type="dxa" w:w="964"/>
           </w:tcPr>
           <w:p>
             <w:r/>
@@ -3076,7 +3366,7 @@
         </w:tc>
         <w:tc>
           <w:tcPr>
-            <w:tcW w:type="dxa" w:w="1077"/>
+            <w:tcW w:type="dxa" w:w="964"/>
           </w:tcPr>
           <w:p>
             <w:r/>
@@ -3090,7 +3380,7 @@
         </w:tc>
         <w:tc>
           <w:tcPr>
-            <w:tcW w:type="dxa" w:w="2721"/>
+            <w:tcW w:type="dxa" w:w="2381"/>
           </w:tcPr>
           <w:p>
             <w:r/>
@@ -3104,7 +3394,7 @@
         </w:tc>
         <w:tc>
           <w:tcPr>
-            <w:tcW w:type="dxa" w:w="1644"/>
+            <w:tcW w:type="dxa" w:w="1474"/>
           </w:tcPr>
           <w:p>
             <w:r/>
@@ -3118,7 +3408,7 @@
         </w:tc>
         <w:tc>
           <w:tcPr>
-            <w:tcW w:type="dxa" w:w="1247"/>
+            <w:tcW w:type="dxa" w:w="1134"/>
           </w:tcPr>
           <w:p>
             <w:r/>
@@ -3132,7 +3422,21 @@
         </w:tc>
         <w:tc>
           <w:tcPr>
-            <w:tcW w:type="dxa" w:w="1474"/>
+            <w:tcW w:type="dxa" w:w="1020"/>
+          </w:tcPr>
+          <w:p>
+            <w:r/>
+            <w:r>
+              <w:rPr>
+                <w:sz w:val="16"/>
+              </w:rPr>
+              <w:t>clean</w:t>
+            </w:r>
+          </w:p>
+        </w:tc>
+        <w:tc>
+          <w:tcPr>
+            <w:tcW w:type="dxa" w:w="1361"/>
           </w:tcPr>
           <w:p>
             <w:r/>
@@ -3152,7 +3456,7 @@
           <w:b w:val="0"/>
           <w:i w:val="0"/>
         </w:rPr>
-        <w:t>Two results stand. Channel yield and failure mode separate the eight conditions at p = 2.2 × 10⁻⁴ and place conditions 5 and 7 ahead of the rest, with no failures in 12 channels each. Series resistance does not separate them, and the reason is measured rather than assumed: fixture repeatability of 0.84 Ω exceeds the bond resistances by more than an order of magnitude.</w:t>
+        <w:t>Three results stand. Channel yield and failure mode separate the eight conditions at p = 2.2 × 10⁻⁴ and place conditions 5 and 7 ahead of the rest, with no failures in 12 channels each. Series resistance does not separate them, and the reason is measured rather than assumed: fixture repeatability of 0.84 Ω exceeds the bond resistances by more than an order of magnitude. Reverse bias found one partial shunt in 34 channels and confirms the yield ranking rather than adding to it.</w:t>
       </w:r>
     </w:p>
     <w:p>
@@ -3161,7 +3465,16 @@
           <w:b w:val="0"/>
           <w:i w:val="0"/>
         </w:rPr>
-        <w:t>The failure modes give a direction as well as a ranking. Conditions 1, 2 and 6 lose channels to detachment and opens, so they are under-bonded. Conditions 3, 4 and 8 lose them to shorts and bridges, so they are over-bonded. Conditions 5 and 7 lose none. A follow-up should sense at the Tier-1 probe pads to make series resistance usable, and should measure reverse leakage, which is insensitive to contact resistance and would quantify the shunt found in Section C.</w:t>
+        <w:t>The failure modes give a direction as well as a ranking. Conditions 1, 2 and 6 lose channels to detachment and opens, so they are under-bonded. Conditions 3, 4 and 8 lose them to shorts and bridges, so they are over-bonded. Conditions 5 and 7 lose none. The reverse check adds that the surviving joints are electrically sound on every condition except 3, which narrows the gap between condition 8 and the two clean conditions: its failures are isolated shorts rather than a coupon-wide problem.</w:t>
+      </w:r>
+    </w:p>
+    <w:p>
+      <w:r>
+        <w:rPr>
+          <w:b w:val="0"/>
+          <w:i w:val="0"/>
+        </w:rPr>
+        <w:t>The one measurement still worth recovering is series resistance. Sensing at the Tier-1 probe pads instead of the breadboard would move the jumper contacts outside the measured loop and bring the repeatability from 0.84 Ω down to the fit precision, which was 0.16 Ω once the firmware was corrected. That is the change that would let R_s resolve a bond difference.</w:t>
       </w:r>
     </w:p>
     <w:p>

</xml_diff>